<commit_message>
Fix policy footer page numbering
</commit_message>
<xml_diff>
--- a/Information Security Policy.docx
+++ b/Information Security Policy.docx
@@ -1318,7 +1318,7 @@
         <w:color w:val="666666"/>
         <w:sz w:val="18"/>
       </w:rPr>
-      <w:t>Information Security Policy  |  Page 1</w:t>
+      <w:t xml:space="preserve">Information Security Policy  |  Page </w:t>
     </w:r>
     <w:r>
       <w:rPr>
@@ -1326,6 +1326,11 @@
         <w:color w:val="666666"/>
         <w:sz w:val="18"/>
       </w:rPr>
+      <w:fldChar w:fldCharType="begin"/>
+      <w:instrText xml:space="preserve"> PAGE </w:instrText>
+      <w:fldChar w:fldCharType="separate"/>
+      <w:t>1</w:t>
+      <w:fldChar w:fldCharType="end"/>
     </w:r>
   </w:p>
 </w:ftr>

</xml_diff>